<commit_message>
Remove PRE-SUBMISSION QA GATE checklists from all drafts per standing instruction
User does not want the QA gate checklist section appearing in delivered
drafts, going forward and retroactively. Stripped it from all five
remaining files that still had it; the two most recent files (Morgan
Stanley application answers, Washington Gas portal answers) already used
the cleaner INTERNAL NOTES format instead and needed no change.

Nothing load-bearing was lost: the open items each QA gate tracked
(business license gaps, unconfirmed deadlines, signature pending, etc.)
were already duplicated in each file's STATUS line, Required Attachments
Checklist, or Open Items section.
</commit_message>
<xml_diff>
--- a/app/drafts/2026-07-dc-arts-humanities-field-trip-arena-stage.docx
+++ b/app/drafts/2026-07-dc-arts-humanities-field-trip-arena-stage.docx
@@ -1469,349 +1469,15 @@
         <w:t xml:space="preserve">Business License note: DC’s Basic Business License (charitable solicitation subtype, DLCP) is required for DC government grant applications regardless of the $25,000 receipts exemption threshold. Apply through DLCP’s online licensing wizard at mybusiness.dc.gov, which auto-generates the required attachment list. This is an operational task for Cole, not something a draft can resolve; start it now given the July 24 deadline.</w:t>
       </w:r>
     </w:p>
+    <w:p>
+      <w:pPr>
+        <w:pStyle w:val="BodyText"/>
+      </w:pPr>
+      <w:r>
+        <w:t xml:space="preserve">GOODProjects, Inc. | 996 Maine Avenue SW, Suite 208, Washington, DC 20024 | EIN 81-1491594 | grants@goodprojects.org</w:t>
+      </w:r>
+    </w:p>
     <w:bookmarkEnd w:id="28"/>
-    <w:bookmarkStart w:id="29" w:name="pre-submission-qa-gate"/>
-    <w:p>
-      <w:pPr>
-        <w:pStyle w:val="Heading2"/>
-      </w:pPr>
-      <w:r>
-        <w:t xml:space="preserve">PRE-SUBMISSION QA GATE</w:t>
-      </w:r>
-    </w:p>
-    <w:p>
-      <w:pPr>
-        <w:numPr>
-          <w:ilvl w:val="0"/>
-          <w:numId w:val="1001"/>
-        </w:numPr>
-        <w:pStyle w:val="Compact"/>
-      </w:pPr>
-      <w:r>
-        <w:rPr>
-          <w:bCs/>
-          <w:b/>
-        </w:rPr>
-        <w:t xml:space="preserve">01.</w:t>
-      </w:r>
-      <w:r>
-        <w:t xml:space="preserve"> </w:t>
-      </w:r>
-      <w:r>
-        <w:t xml:space="preserve">[x] All placeholders filled with real, verified figures</w:t>
-      </w:r>
-    </w:p>
-    <w:p>
-      <w:pPr>
-        <w:numPr>
-          <w:ilvl w:val="0"/>
-          <w:numId w:val="1001"/>
-        </w:numPr>
-        <w:pStyle w:val="Compact"/>
-      </w:pPr>
-      <w:r>
-        <w:rPr>
-          <w:bCs/>
-          <w:b/>
-        </w:rPr>
-        <w:t xml:space="preserve">02.</w:t>
-      </w:r>
-      <w:r>
-        <w:t xml:space="preserve"> </w:t>
-      </w:r>
-      <w:r>
-        <w:t xml:space="preserve">[ ] Funder ask is within the stated cap: no published per-grant cap found; this is a modest, conservatively built estimate, not a confirmed ceiling</w:t>
-      </w:r>
-    </w:p>
-    <w:p>
-      <w:pPr>
-        <w:numPr>
-          <w:ilvl w:val="0"/>
-          <w:numId w:val="1001"/>
-        </w:numPr>
-        <w:pStyle w:val="Compact"/>
-      </w:pPr>
-      <w:r>
-        <w:rPr>
-          <w:bCs/>
-          <w:b/>
-        </w:rPr>
-        <w:t xml:space="preserve">03.</w:t>
-      </w:r>
-      <w:r>
-        <w:t xml:space="preserve"> </w:t>
-      </w:r>
-      <w:r>
-        <w:t xml:space="preserve">[x] Budget total matches the headline ask</w:t>
-      </w:r>
-    </w:p>
-    <w:p>
-      <w:pPr>
-        <w:numPr>
-          <w:ilvl w:val="0"/>
-          <w:numId w:val="1001"/>
-        </w:numPr>
-        <w:pStyle w:val="Compact"/>
-      </w:pPr>
-      <w:r>
-        <w:rPr>
-          <w:bCs/>
-          <w:b/>
-        </w:rPr>
-        <w:t xml:space="preserve">04.</w:t>
-      </w:r>
-      <w:r>
-        <w:t xml:space="preserve"> </w:t>
-      </w:r>
-      <w:r>
-        <w:t xml:space="preserve">[ ] Field trip logistics not yet confirmed with Stephanie Page-Baxter or Phileke Holland. Do this before submitting, not after; this is the one blocker only program staff can clear</w:t>
-      </w:r>
-    </w:p>
-    <w:p>
-      <w:pPr>
-        <w:numPr>
-          <w:ilvl w:val="0"/>
-          <w:numId w:val="1001"/>
-        </w:numPr>
-        <w:pStyle w:val="Compact"/>
-      </w:pPr>
-      <w:r>
-        <w:rPr>
-          <w:bCs/>
-          <w:b/>
-        </w:rPr>
-        <w:t xml:space="preserve">05.</w:t>
-      </w:r>
-      <w:r>
-        <w:t xml:space="preserve"> </w:t>
-      </w:r>
-      <w:r>
-        <w:t xml:space="preserve">[x] No Cara Adams in the staffing section</w:t>
-      </w:r>
-    </w:p>
-    <w:p>
-      <w:pPr>
-        <w:numPr>
-          <w:ilvl w:val="0"/>
-          <w:numId w:val="1001"/>
-        </w:numPr>
-        <w:pStyle w:val="Compact"/>
-      </w:pPr>
-      <w:r>
-        <w:rPr>
-          <w:bCs/>
-          <w:b/>
-        </w:rPr>
-        <w:t xml:space="preserve">06.</w:t>
-      </w:r>
-      <w:r>
-        <w:t xml:space="preserve"> </w:t>
-      </w:r>
-      <w:r>
-        <w:t xml:space="preserve">[x] Address reads: 996 Maine Avenue SW, Suite 208, Washington, DC 20024 (add to signature block before submission)</w:t>
-      </w:r>
-    </w:p>
-    <w:p>
-      <w:pPr>
-        <w:numPr>
-          <w:ilvl w:val="0"/>
-          <w:numId w:val="1001"/>
-        </w:numPr>
-        <w:pStyle w:val="Compact"/>
-      </w:pPr>
-      <w:r>
-        <w:rPr>
-          <w:bCs/>
-          <w:b/>
-        </w:rPr>
-        <w:t xml:space="preserve">07.</w:t>
-      </w:r>
-      <w:r>
-        <w:t xml:space="preserve"> </w:t>
-      </w:r>
-      <w:r>
-        <w:t xml:space="preserve">[x] Geography confirmed: Ward 6 origin, DC-based destination (Arena Stage, Southwest DC)</w:t>
-      </w:r>
-    </w:p>
-    <w:p>
-      <w:pPr>
-        <w:numPr>
-          <w:ilvl w:val="0"/>
-          <w:numId w:val="1001"/>
-        </w:numPr>
-        <w:pStyle w:val="Compact"/>
-      </w:pPr>
-      <w:r>
-        <w:rPr>
-          <w:bCs/>
-          <w:b/>
-        </w:rPr>
-        <w:t xml:space="preserve">08.</w:t>
-      </w:r>
-      <w:r>
-        <w:t xml:space="preserve"> </w:t>
-      </w:r>
-      <w:r>
-        <w:t xml:space="preserve">[x] Executive summary tailored to CAH’s Field Trip Experiences priority</w:t>
-      </w:r>
-    </w:p>
-    <w:p>
-      <w:pPr>
-        <w:numPr>
-          <w:ilvl w:val="0"/>
-          <w:numId w:val="1001"/>
-        </w:numPr>
-        <w:pStyle w:val="Compact"/>
-      </w:pPr>
-      <w:r>
-        <w:rPr>
-          <w:bCs/>
-          <w:b/>
-        </w:rPr>
-        <w:t xml:space="preserve">09.</w:t>
-      </w:r>
-      <w:r>
-        <w:t xml:space="preserve"> </w:t>
-      </w:r>
-      <w:r>
-        <w:t xml:space="preserve">[x] Proof metrics chosen match the funder’s domain</w:t>
-      </w:r>
-    </w:p>
-    <w:p>
-      <w:pPr>
-        <w:numPr>
-          <w:ilvl w:val="0"/>
-          <w:numId w:val="1001"/>
-        </w:numPr>
-        <w:pStyle w:val="Compact"/>
-      </w:pPr>
-      <w:r>
-        <w:rPr>
-          <w:bCs/>
-          <w:b/>
-        </w:rPr>
-        <w:t xml:space="preserve">10.</w:t>
-      </w:r>
-      <w:r>
-        <w:t xml:space="preserve"> </w:t>
-      </w:r>
-      <w:r>
-        <w:t xml:space="preserve">[x] Deadline confirmed: Friday, July 24, 2026, 5:00 pm ET (CAH’s official grant page)</w:t>
-      </w:r>
-    </w:p>
-    <w:p>
-      <w:pPr>
-        <w:numPr>
-          <w:ilvl w:val="0"/>
-          <w:numId w:val="1001"/>
-        </w:numPr>
-        <w:pStyle w:val="Compact"/>
-      </w:pPr>
-      <w:r>
-        <w:rPr>
-          <w:bCs/>
-          <w:b/>
-        </w:rPr>
-        <w:t xml:space="preserve">11.</w:t>
-      </w:r>
-      <w:r>
-        <w:t xml:space="preserve"> </w:t>
-      </w:r>
-      <w:r>
-        <w:t xml:space="preserve">[ ] Attachments not yet assembled. Business License still needs to be obtained through DLCP (see note above)</w:t>
-      </w:r>
-    </w:p>
-    <w:p>
-      <w:pPr>
-        <w:numPr>
-          <w:ilvl w:val="0"/>
-          <w:numId w:val="1001"/>
-        </w:numPr>
-        <w:pStyle w:val="Compact"/>
-      </w:pPr>
-      <w:r>
-        <w:rPr>
-          <w:bCs/>
-          <w:b/>
-        </w:rPr>
-        <w:t xml:space="preserve">12.</w:t>
-      </w:r>
-      <w:r>
-        <w:t xml:space="preserve"> </w:t>
-      </w:r>
-      <w:r>
-        <w:t xml:space="preserve">[ ] Darius Baxter has not yet signed; route through Neo first</w:t>
-      </w:r>
-    </w:p>
-    <w:p>
-      <w:pPr>
-        <w:numPr>
-          <w:ilvl w:val="0"/>
-          <w:numId w:val="1001"/>
-        </w:numPr>
-        <w:pStyle w:val="Compact"/>
-      </w:pPr>
-      <w:r>
-        <w:rPr>
-          <w:bCs/>
-          <w:b/>
-        </w:rPr>
-        <w:t xml:space="preserve">13.</w:t>
-      </w:r>
-      <w:r>
-        <w:t xml:space="preserve"> </w:t>
-      </w:r>
-      <w:r>
-        <w:t xml:space="preserve">[x] Humanize pass completed (no em or en dashes, no significance inflation, no vague attributions)</w:t>
-      </w:r>
-    </w:p>
-    <w:p>
-      <w:pPr>
-        <w:numPr>
-          <w:ilvl w:val="0"/>
-          <w:numId w:val="1001"/>
-        </w:numPr>
-        <w:pStyle w:val="Compact"/>
-      </w:pPr>
-      <w:r>
-        <w:rPr>
-          <w:bCs/>
-          <w:b/>
-        </w:rPr>
-        <w:t xml:space="preserve">14.</w:t>
-      </w:r>
-      <w:r>
-        <w:t xml:space="preserve"> </w:t>
-      </w:r>
-      <w:r>
-        <w:t xml:space="preserve">[x] PDF generated:</w:t>
-      </w:r>
-      <w:r>
-        <w:t xml:space="preserve"> </w:t>
-      </w:r>
-      <w:r>
-        <w:rPr>
-          <w:rStyle w:val="VerbatimChar"/>
-        </w:rPr>
-        <w:t xml:space="preserve">2026-07-dc-arts-humanities-field-trip-arena-stage.pdf</w:t>
-      </w:r>
-    </w:p>
-    <w:p>
-      <w:r>
-        <w:pict>
-          <v:rect style="width:0;height:1.5pt" o:hralign="center" o:hrstd="t" o:hr="t"/>
-        </w:pict>
-      </w:r>
-    </w:p>
-    <w:p>
-      <w:pPr>
-        <w:pStyle w:val="FirstParagraph"/>
-      </w:pPr>
-      <w:r>
-        <w:t xml:space="preserve">GOODProjects, Inc. | 996 Maine Avenue SW, Suite 208, Washington, DC 20024 | EIN 81-1491594 | grants@goodprojects.org</w:t>
-      </w:r>
-    </w:p>
-    <w:bookmarkEnd w:id="29"/>
     <w:sectPr/>
   </w:body>
 </w:document>
@@ -1918,87 +1584,8 @@
       </w:pPr>
     </w:lvl>
   </w:abstractNum>
-  <w:abstractNum w:abstractNumId="991">
-    <w:nsid w:val="A991"/>
-    <w:multiLevelType w:val="multilevel"/>
-    <w:lvl w:ilvl="0">
-      <w:numFmt w:val="bullet"/>
-      <w:lvlText w:val="•"/>
-      <w:lvlJc w:val="left"/>
-      <w:pPr>
-        <w:ind w:left="720" w:hanging="480"/>
-      </w:pPr>
-    </w:lvl>
-    <w:lvl w:ilvl="1">
-      <w:numFmt w:val="bullet"/>
-      <w:lvlText w:val="–"/>
-      <w:lvlJc w:val="left"/>
-      <w:pPr>
-        <w:ind w:left="1440" w:hanging="480"/>
-      </w:pPr>
-    </w:lvl>
-    <w:lvl w:ilvl="2">
-      <w:numFmt w:val="bullet"/>
-      <w:lvlText w:val="•"/>
-      <w:lvlJc w:val="left"/>
-      <w:pPr>
-        <w:ind w:left="2160" w:hanging="480"/>
-      </w:pPr>
-    </w:lvl>
-    <w:lvl w:ilvl="3">
-      <w:numFmt w:val="bullet"/>
-      <w:lvlText w:val="–"/>
-      <w:lvlJc w:val="left"/>
-      <w:pPr>
-        <w:ind w:left="2880" w:hanging="480"/>
-      </w:pPr>
-    </w:lvl>
-    <w:lvl w:ilvl="4">
-      <w:numFmt w:val="bullet"/>
-      <w:lvlText w:val="•"/>
-      <w:lvlJc w:val="left"/>
-      <w:pPr>
-        <w:ind w:left="3600" w:hanging="480"/>
-      </w:pPr>
-    </w:lvl>
-    <w:lvl w:ilvl="5">
-      <w:numFmt w:val="bullet"/>
-      <w:lvlText w:val="–"/>
-      <w:lvlJc w:val="left"/>
-      <w:pPr>
-        <w:ind w:left="4320" w:hanging="480"/>
-      </w:pPr>
-    </w:lvl>
-    <w:lvl w:ilvl="6">
-      <w:numFmt w:val="bullet"/>
-      <w:lvlText w:val="•"/>
-      <w:lvlJc w:val="left"/>
-      <w:pPr>
-        <w:ind w:left="5040" w:hanging="480"/>
-      </w:pPr>
-    </w:lvl>
-    <w:lvl w:ilvl="7">
-      <w:numFmt w:val="bullet"/>
-      <w:lvlText w:val="–"/>
-      <w:lvlJc w:val="left"/>
-      <w:pPr>
-        <w:ind w:left="5760" w:hanging="480"/>
-      </w:pPr>
-    </w:lvl>
-    <w:lvl w:ilvl="8">
-      <w:numFmt w:val="bullet"/>
-      <w:lvlText w:val="•"/>
-      <w:lvlJc w:val="left"/>
-      <w:pPr>
-        <w:ind w:left="6480" w:hanging="480"/>
-      </w:pPr>
-    </w:lvl>
-  </w:abstractNum>
   <w:num w:numId="1000">
     <w:abstractNumId w:val="990"/>
-  </w:num>
-  <w:num w:numId="1001">
-    <w:abstractNumId w:val="991"/>
   </w:num>
 </w:numbering>
 </file>

</xml_diff>